<commit_message>
💾 Update generated files
</commit_message>
<xml_diff>
--- a/reports/0_joueur.docx
+++ b/reports/0_joueur.docx
@@ -20283,7 +20283,7 @@
         <w:rPr>
           <w:sz w:val="26"/>
         </w:rPr>
-        <w:t>Gabe Perreault: 5</w:t>
+        <w:t>Gabe Perreault: 6</w:t>
       </w:r>
     </w:p>
     <w:p>
@@ -20323,23 +20323,271 @@
         <w:rPr>
           <w:sz w:val="26"/>
         </w:rPr>
-        <w:t>Taylor Raddysh: 8</w:t>
-      </w:r>
-    </w:p>
-    <w:p>
-      <w:pPr>
-        <w:pStyle w:val="ListBullet"/>
-      </w:pPr>
-      <w:r>
-        <w:t>2022: 0.00</w:t>
-      </w:r>
-    </w:p>
-    <w:p>
-      <w:pPr>
-        <w:pStyle w:val="ListBullet"/>
-      </w:pPr>
-      <w:r>
-        <w:t>2023: 0.00</w:t>
+        <w:t>Taylor Raddysh: 9</w:t>
+      </w:r>
+    </w:p>
+    <w:p>
+      <w:pPr>
+        <w:pStyle w:val="ListBullet"/>
+      </w:pPr>
+      <w:r>
+        <w:t>2022: 0.00</w:t>
+      </w:r>
+    </w:p>
+    <w:p>
+      <w:pPr>
+        <w:pStyle w:val="ListBullet"/>
+      </w:pPr>
+      <w:r>
+        <w:t>2023: 0.00</w:t>
+      </w:r>
+    </w:p>
+    <w:p>
+      <w:pPr>
+        <w:pStyle w:val="ListBullet"/>
+      </w:pPr>
+      <w:r>
+        <w:t>2024: 0.00</w:t>
+      </w:r>
+    </w:p>
+    <w:p>
+      <w:pPr>
+        <w:pStyle w:val="ListBullet"/>
+      </w:pPr>
+      <w:r>
+        <w:t>2025: 0.00</w:t>
+      </w:r>
+    </w:p>
+    <w:p>
+      <w:r>
+        <w:rPr>
+          <w:sz w:val="26"/>
+        </w:rPr>
+        <w:t>Jaroslav Chmelar: 5</w:t>
+      </w:r>
+    </w:p>
+    <w:p>
+      <w:pPr>
+        <w:pStyle w:val="ListBullet"/>
+      </w:pPr>
+      <w:r>
+        <w:t>2022: 0.00</w:t>
+      </w:r>
+    </w:p>
+    <w:p>
+      <w:pPr>
+        <w:pStyle w:val="ListBullet"/>
+      </w:pPr>
+      <w:r>
+        <w:t>2023: 0.00</w:t>
+      </w:r>
+    </w:p>
+    <w:p>
+      <w:pPr>
+        <w:pStyle w:val="ListBullet"/>
+      </w:pPr>
+      <w:r>
+        <w:t>2024: 0.00</w:t>
+      </w:r>
+    </w:p>
+    <w:p>
+      <w:pPr>
+        <w:pStyle w:val="ListBullet"/>
+      </w:pPr>
+      <w:r>
+        <w:t>2025: 0.00</w:t>
+      </w:r>
+    </w:p>
+    <w:p>
+      <w:r>
+        <w:rPr>
+          <w:sz w:val="26"/>
+        </w:rPr>
+        <w:t>Brett Berard: 14</w:t>
+      </w:r>
+    </w:p>
+    <w:p>
+      <w:pPr>
+        <w:pStyle w:val="ListBullet"/>
+      </w:pPr>
+      <w:r>
+        <w:t>2022: 0.00</w:t>
+      </w:r>
+    </w:p>
+    <w:p>
+      <w:pPr>
+        <w:pStyle w:val="ListBullet"/>
+      </w:pPr>
+      <w:r>
+        <w:t>2023: 0.00</w:t>
+      </w:r>
+    </w:p>
+    <w:p>
+      <w:pPr>
+        <w:pStyle w:val="ListBullet"/>
+      </w:pPr>
+      <w:r>
+        <w:t>2024: 0.00</w:t>
+      </w:r>
+    </w:p>
+    <w:p>
+      <w:pPr>
+        <w:pStyle w:val="ListBullet"/>
+      </w:pPr>
+      <w:r>
+        <w:t>2025: 0.00</w:t>
+      </w:r>
+    </w:p>
+    <w:p>
+      <w:r>
+        <w:rPr>
+          <w:sz w:val="26"/>
+        </w:rPr>
+        <w:t>Urho Vaakanainen: 53</w:t>
+      </w:r>
+    </w:p>
+    <w:p>
+      <w:pPr>
+        <w:pStyle w:val="ListBullet"/>
+      </w:pPr>
+      <w:r>
+        <w:t>2022: 0.00</w:t>
+      </w:r>
+    </w:p>
+    <w:p>
+      <w:pPr>
+        <w:pStyle w:val="ListBullet"/>
+      </w:pPr>
+      <w:r>
+        <w:t>2023: 0.00</w:t>
+      </w:r>
+    </w:p>
+    <w:p>
+      <w:pPr>
+        <w:pStyle w:val="ListBullet"/>
+      </w:pPr>
+      <w:r>
+        <w:t>2024: 0.00</w:t>
+      </w:r>
+    </w:p>
+    <w:p>
+      <w:pPr>
+        <w:pStyle w:val="ListBullet"/>
+      </w:pPr>
+      <w:r>
+        <w:t>2025: 0.00</w:t>
+      </w:r>
+    </w:p>
+    <w:p>
+      <w:r>
+        <w:rPr>
+          <w:sz w:val="26"/>
+        </w:rPr>
+        <w:t>Juuso Parssinen: 15</w:t>
+      </w:r>
+    </w:p>
+    <w:p>
+      <w:pPr>
+        <w:pStyle w:val="ListBullet"/>
+      </w:pPr>
+      <w:r>
+        <w:t>2022: 0.00</w:t>
+      </w:r>
+    </w:p>
+    <w:p>
+      <w:pPr>
+        <w:pStyle w:val="ListBullet"/>
+      </w:pPr>
+      <w:r>
+        <w:t>2023: 0.00</w:t>
+      </w:r>
+    </w:p>
+    <w:p>
+      <w:pPr>
+        <w:pStyle w:val="ListBullet"/>
+      </w:pPr>
+      <w:r>
+        <w:t>2024: 0.00</w:t>
+      </w:r>
+    </w:p>
+    <w:p>
+      <w:pPr>
+        <w:pStyle w:val="ListBullet"/>
+      </w:pPr>
+      <w:r>
+        <w:t>2025: 0.00</w:t>
+      </w:r>
+    </w:p>
+    <w:p>
+      <w:r>
+        <w:rPr>
+          <w:sz w:val="26"/>
+        </w:rPr>
+        <w:t>Brennan Othmann: 8</w:t>
+      </w:r>
+    </w:p>
+    <w:p>
+      <w:pPr>
+        <w:pStyle w:val="ListBullet"/>
+      </w:pPr>
+      <w:r>
+        <w:t>2022: 0.00</w:t>
+      </w:r>
+    </w:p>
+    <w:p>
+      <w:pPr>
+        <w:pStyle w:val="ListBullet"/>
+      </w:pPr>
+      <w:r>
+        <w:t>2023: 0.00</w:t>
+      </w:r>
+    </w:p>
+    <w:p>
+      <w:pPr>
+        <w:pStyle w:val="ListBullet"/>
+      </w:pPr>
+      <w:r>
+        <w:t>2024: 0.00</w:t>
+      </w:r>
+    </w:p>
+    <w:p>
+      <w:pPr>
+        <w:pStyle w:val="ListBullet"/>
+      </w:pPr>
+      <w:r>
+        <w:t>2025: 0.00</w:t>
+      </w:r>
+    </w:p>
+    <w:p>
+      <w:r>
+        <w:rPr>
+          <w:sz w:val="26"/>
+        </w:rPr>
+        <w:t>Vladislav Gavrikov: 3</w:t>
+      </w:r>
+    </w:p>
+    <w:p>
+      <w:pPr>
+        <w:pStyle w:val="ListBullet"/>
+      </w:pPr>
+      <w:r>
+        <w:t>2022: 0.00</w:t>
+      </w:r>
+    </w:p>
+    <w:p>
+      <w:pPr>
+        <w:pStyle w:val="ListBullet"/>
+      </w:pPr>
+      <w:r>
+        <w:t>2023: 0.00</w:t>
+      </w:r>
+    </w:p>
+    <w:p>
+      <w:pPr>
+        <w:pStyle w:val="ListBullet"/>
+      </w:pPr>
+      <w:r>
+        <w:t>2024: 0.00</w:t>
       </w:r>
     </w:p>
     <w:p>
@@ -20351,47 +20599,103 @@
           <w:b/>
           <w:color w:val="FF0000"/>
         </w:rPr>
-        <w:t>2024: 0.33</w:t>
-      </w:r>
-    </w:p>
-    <w:p>
-      <w:pPr>
-        <w:pStyle w:val="ListBullet"/>
-      </w:pPr>
-      <w:r>
-        <w:t>2025: 0.00</w:t>
-      </w:r>
-    </w:p>
-    <w:p>
-      <w:r>
-        <w:rPr>
-          <w:sz w:val="26"/>
-        </w:rPr>
-        <w:t>Jaroslav Chmelar: 4</w:t>
-      </w:r>
-    </w:p>
-    <w:p>
-      <w:pPr>
-        <w:pStyle w:val="ListBullet"/>
-      </w:pPr>
-      <w:r>
-        <w:t>2022: 0.00</w:t>
-      </w:r>
-    </w:p>
-    <w:p>
-      <w:pPr>
-        <w:pStyle w:val="ListBullet"/>
-      </w:pPr>
-      <w:r>
-        <w:t>2023: 0.00</w:t>
-      </w:r>
-    </w:p>
-    <w:p>
-      <w:pPr>
-        <w:pStyle w:val="ListBullet"/>
-      </w:pPr>
-      <w:r>
-        <w:t>2024: 0.00</w:t>
+        <w:t>2025: 0.23</w:t>
+      </w:r>
+    </w:p>
+    <w:p>
+      <w:r>
+        <w:rPr>
+          <w:sz w:val="26"/>
+        </w:rPr>
+        <w:t>Will Cuylle: 9</w:t>
+      </w:r>
+    </w:p>
+    <w:p>
+      <w:pPr>
+        <w:pStyle w:val="ListBullet"/>
+      </w:pPr>
+      <w:r>
+        <w:t>2022: 0.00</w:t>
+      </w:r>
+    </w:p>
+    <w:p>
+      <w:pPr>
+        <w:pStyle w:val="ListBullet"/>
+      </w:pPr>
+      <w:r>
+        <w:t>2023: 0.00</w:t>
+      </w:r>
+    </w:p>
+    <w:p>
+      <w:pPr>
+        <w:pStyle w:val="ListBullet"/>
+      </w:pPr>
+      <w:r>
+        <w:t>2024: 0.00</w:t>
+      </w:r>
+    </w:p>
+    <w:p>
+      <w:pPr>
+        <w:pStyle w:val="ListBullet"/>
+      </w:pPr>
+      <w:r>
+        <w:t>2025: 0.08</w:t>
+      </w:r>
+    </w:p>
+    <w:p>
+      <w:r>
+        <w:rPr>
+          <w:sz w:val="26"/>
+        </w:rPr>
+        <w:t>Noah Laba: 2</w:t>
+      </w:r>
+    </w:p>
+    <w:p>
+      <w:pPr>
+        <w:pStyle w:val="ListBullet"/>
+      </w:pPr>
+      <w:r>
+        <w:t>2022: 0.00</w:t>
+      </w:r>
+    </w:p>
+    <w:p>
+      <w:pPr>
+        <w:pStyle w:val="ListBullet"/>
+      </w:pPr>
+      <w:r>
+        <w:t>2023: 0.00</w:t>
+      </w:r>
+    </w:p>
+    <w:p>
+      <w:pPr>
+        <w:pStyle w:val="ListBullet"/>
+      </w:pPr>
+      <w:r>
+        <w:t>2024: 0.00</w:t>
+      </w:r>
+    </w:p>
+    <w:p>
+      <w:pPr>
+        <w:pStyle w:val="ListBullet"/>
+      </w:pPr>
+      <w:r>
+        <w:t>2025: 0.12</w:t>
+      </w:r>
+    </w:p>
+    <w:p>
+      <w:r>
+        <w:rPr>
+          <w:sz w:val="26"/>
+        </w:rPr>
+        <w:t>Mika Zibanejad: 1</w:t>
+      </w:r>
+    </w:p>
+    <w:p>
+      <w:pPr>
+        <w:pStyle w:val="ListBullet"/>
+      </w:pPr>
+      <w:r>
+        <w:t>2022: 0.14</w:t>
       </w:r>
     </w:p>
     <w:p>
@@ -20403,95 +20707,15 @@
           <w:b/>
           <w:color w:val="FF0000"/>
         </w:rPr>
-        <w:t>2025: 1.00</w:t>
-      </w:r>
-    </w:p>
-    <w:p>
-      <w:r>
-        <w:rPr>
-          <w:sz w:val="26"/>
-        </w:rPr>
-        <w:t>Brett Berard: 14</w:t>
-      </w:r>
-    </w:p>
-    <w:p>
-      <w:pPr>
-        <w:pStyle w:val="ListBullet"/>
-      </w:pPr>
-      <w:r>
-        <w:t>2022: 0.00</w:t>
-      </w:r>
-    </w:p>
-    <w:p>
-      <w:pPr>
-        <w:pStyle w:val="ListBullet"/>
-      </w:pPr>
-      <w:r>
-        <w:t>2023: 0.00</w:t>
-      </w:r>
-    </w:p>
-    <w:p>
-      <w:pPr>
-        <w:pStyle w:val="ListBullet"/>
-      </w:pPr>
-      <w:r>
-        <w:t>2024: 0.00</w:t>
-      </w:r>
-    </w:p>
-    <w:p>
-      <w:pPr>
-        <w:pStyle w:val="ListBullet"/>
-      </w:pPr>
-      <w:r>
-        <w:t>2025: 0.00</w:t>
-      </w:r>
-    </w:p>
-    <w:p>
-      <w:r>
-        <w:rPr>
-          <w:sz w:val="26"/>
-        </w:rPr>
-        <w:t>Urho Vaakanainen: 53</w:t>
-      </w:r>
-    </w:p>
-    <w:p>
-      <w:pPr>
-        <w:pStyle w:val="ListBullet"/>
-      </w:pPr>
-      <w:r>
-        <w:t>2022: 0.00</w:t>
-      </w:r>
-    </w:p>
-    <w:p>
-      <w:pPr>
-        <w:pStyle w:val="ListBullet"/>
-      </w:pPr>
-      <w:r>
-        <w:t>2023: 0.00</w:t>
-      </w:r>
-    </w:p>
-    <w:p>
-      <w:pPr>
-        <w:pStyle w:val="ListBullet"/>
-      </w:pPr>
-      <w:r>
-        <w:t>2024: 0.00</w:t>
-      </w:r>
-    </w:p>
-    <w:p>
-      <w:pPr>
-        <w:pStyle w:val="ListBullet"/>
-      </w:pPr>
-      <w:r>
-        <w:t>2025: 0.00</w:t>
-      </w:r>
-    </w:p>
-    <w:p>
-      <w:r>
-        <w:rPr>
-          <w:sz w:val="26"/>
-        </w:rPr>
-        <w:t>Juuso Parssinen: 14</w:t>
+        <w:t>2023: 0.32</w:t>
+      </w:r>
+    </w:p>
+    <w:p>
+      <w:pPr>
+        <w:pStyle w:val="ListBullet"/>
+      </w:pPr>
+      <w:r>
+        <w:t>2024: 0.17</w:t>
       </w:r>
     </w:p>
     <w:p>
@@ -20503,15 +20727,31 @@
           <w:b/>
           <w:color w:val="FF0000"/>
         </w:rPr>
-        <w:t>2022: 0.25</w:t>
-      </w:r>
-    </w:p>
-    <w:p>
-      <w:pPr>
-        <w:pStyle w:val="ListBullet"/>
-      </w:pPr>
-      <w:r>
-        <w:t>2023: 0.14</w:t>
+        <w:t>2025: 0.35</w:t>
+      </w:r>
+    </w:p>
+    <w:p>
+      <w:r>
+        <w:rPr>
+          <w:sz w:val="26"/>
+        </w:rPr>
+        <w:t>Matt Rempe: 23</w:t>
+      </w:r>
+    </w:p>
+    <w:p>
+      <w:pPr>
+        <w:pStyle w:val="ListBullet"/>
+      </w:pPr>
+      <w:r>
+        <w:t>2022: 0.00</w:t>
+      </w:r>
+    </w:p>
+    <w:p>
+      <w:pPr>
+        <w:pStyle w:val="ListBullet"/>
+      </w:pPr>
+      <w:r>
+        <w:t>2023: 0.00</w:t>
       </w:r>
     </w:p>
     <w:p>
@@ -20535,167 +20775,23 @@
         <w:rPr>
           <w:sz w:val="26"/>
         </w:rPr>
-        <w:t>Brennan Othmann: 8</w:t>
-      </w:r>
-    </w:p>
-    <w:p>
-      <w:pPr>
-        <w:pStyle w:val="ListBullet"/>
-      </w:pPr>
-      <w:r>
-        <w:t>2022: 0.00</w:t>
-      </w:r>
-    </w:p>
-    <w:p>
-      <w:pPr>
-        <w:pStyle w:val="ListBullet"/>
-      </w:pPr>
-      <w:r>
-        <w:t>2023: 0.00</w:t>
-      </w:r>
-    </w:p>
-    <w:p>
-      <w:pPr>
-        <w:pStyle w:val="ListBullet"/>
-      </w:pPr>
-      <w:r>
-        <w:t>2024: 0.00</w:t>
-      </w:r>
-    </w:p>
-    <w:p>
-      <w:pPr>
-        <w:pStyle w:val="ListBullet"/>
-      </w:pPr>
-      <w:r>
-        <w:t>2025: 0.00</w:t>
-      </w:r>
-    </w:p>
-    <w:p>
-      <w:r>
-        <w:rPr>
-          <w:sz w:val="26"/>
-        </w:rPr>
-        <w:t>Vladislav Gavrikov: 2</w:t>
-      </w:r>
-    </w:p>
-    <w:p>
-      <w:pPr>
-        <w:pStyle w:val="ListBullet"/>
-      </w:pPr>
-      <w:r>
-        <w:t>2022: 0.00</w:t>
-      </w:r>
-    </w:p>
-    <w:p>
-      <w:pPr>
-        <w:pStyle w:val="ListBullet"/>
-      </w:pPr>
-      <w:r>
-        <w:t>2023: 0.00</w:t>
-      </w:r>
-    </w:p>
-    <w:p>
-      <w:pPr>
-        <w:pStyle w:val="ListBullet"/>
-      </w:pPr>
-      <w:r>
-        <w:t>2024: 0.00</w:t>
-      </w:r>
-    </w:p>
-    <w:p>
-      <w:pPr>
-        <w:pStyle w:val="ListBullet"/>
-      </w:pPr>
-      <w:r>
-        <w:t>2025: 0.08</w:t>
-      </w:r>
-    </w:p>
-    <w:p>
-      <w:r>
-        <w:rPr>
-          <w:sz w:val="26"/>
-        </w:rPr>
-        <w:t>Will Cuylle: 8</w:t>
-      </w:r>
-    </w:p>
-    <w:p>
-      <w:pPr>
-        <w:pStyle w:val="ListBullet"/>
-      </w:pPr>
-      <w:r>
-        <w:t>2022: 0.00</w:t>
-      </w:r>
-    </w:p>
-    <w:p>
-      <w:pPr>
-        <w:pStyle w:val="ListBullet"/>
-      </w:pPr>
-      <w:r>
-        <w:t>2023: 0.00</w:t>
-      </w:r>
-    </w:p>
-    <w:p>
-      <w:pPr>
-        <w:pStyle w:val="ListBullet"/>
-      </w:pPr>
-      <w:r>
-        <w:t>2024: 0.00</w:t>
-      </w:r>
-    </w:p>
-    <w:p>
-      <w:pPr>
-        <w:pStyle w:val="ListBullet"/>
-      </w:pPr>
-      <w:r>
-        <w:t>2025: 0.00</w:t>
-      </w:r>
-    </w:p>
-    <w:p>
-      <w:r>
-        <w:rPr>
-          <w:sz w:val="26"/>
-        </w:rPr>
-        <w:t>Noah Laba: 2</w:t>
-      </w:r>
-    </w:p>
-    <w:p>
-      <w:pPr>
-        <w:pStyle w:val="ListBullet"/>
-      </w:pPr>
-      <w:r>
-        <w:t>2022: 0.00</w:t>
-      </w:r>
-    </w:p>
-    <w:p>
-      <w:pPr>
-        <w:pStyle w:val="ListBullet"/>
-      </w:pPr>
-      <w:r>
-        <w:t>2023: 0.00</w:t>
-      </w:r>
-    </w:p>
-    <w:p>
-      <w:pPr>
-        <w:pStyle w:val="ListBullet"/>
-      </w:pPr>
-      <w:r>
-        <w:t>2024: 0.00</w:t>
-      </w:r>
-    </w:p>
-    <w:p>
-      <w:pPr>
-        <w:pStyle w:val="ListBullet"/>
-      </w:pPr>
-      <w:r>
-        <w:t>2025: 0.12</w:t>
-      </w:r>
-    </w:p>
-    <w:p>
-      <w:r>
-        <w:rPr>
-          <w:sz w:val="26"/>
-        </w:rPr>
-        <w:t>Mika Zibanejad: 0</w:t>
+        <w:t>Will Borgen: 9</w:t>
+      </w:r>
+    </w:p>
+    <w:p>
+      <w:pPr>
+        <w:pStyle w:val="ListBullet"/>
+      </w:pPr>
+      <w:r>
+        <w:t>2022: 0.00</w:t>
+      </w:r>
+    </w:p>
+    <w:p>
+      <w:pPr>
+        <w:pStyle w:val="ListBullet"/>
+      </w:pPr>
+      <w:r>
+        <w:t>2023: 0.00</w:t>
       </w:r>
     </w:p>
     <w:p>
@@ -20707,7 +20803,87 @@
           <w:b/>
           <w:color w:val="FF0000"/>
         </w:rPr>
-        <w:t>2022: 0.45</w:t>
+        <w:t>2024: 0.25</w:t>
+      </w:r>
+    </w:p>
+    <w:p>
+      <w:pPr>
+        <w:pStyle w:val="ListBullet"/>
+      </w:pPr>
+      <w:r>
+        <w:t>2025: 0.00</w:t>
+      </w:r>
+    </w:p>
+    <w:p>
+      <w:r>
+        <w:rPr>
+          <w:sz w:val="26"/>
+        </w:rPr>
+        <w:t>Alexis Lafrenire: 2</w:t>
+      </w:r>
+    </w:p>
+    <w:p>
+      <w:pPr>
+        <w:pStyle w:val="ListBullet"/>
+      </w:pPr>
+      <w:r>
+        <w:t>2022: 0.14</w:t>
+      </w:r>
+    </w:p>
+    <w:p>
+      <w:pPr>
+        <w:pStyle w:val="ListBullet"/>
+      </w:pPr>
+      <w:r>
+        <w:t>2023: 0.18</w:t>
+      </w:r>
+    </w:p>
+    <w:p>
+      <w:pPr>
+        <w:pStyle w:val="ListBullet"/>
+      </w:pPr>
+      <w:r>
+        <w:t>2024: 0.07</w:t>
+      </w:r>
+    </w:p>
+    <w:p>
+      <w:pPr>
+        <w:pStyle w:val="ListBullet"/>
+      </w:pPr>
+      <w:r>
+        <w:t>2025: 0.06</w:t>
+      </w:r>
+    </w:p>
+    <w:p>
+      <w:r>
+        <w:rPr>
+          <w:sz w:val="26"/>
+        </w:rPr>
+        <w:t>Braden Schneider: 29</w:t>
+      </w:r>
+    </w:p>
+    <w:p>
+      <w:pPr>
+        <w:pStyle w:val="ListBullet"/>
+      </w:pPr>
+      <w:r>
+        <w:t>2022: 0.00</w:t>
+      </w:r>
+    </w:p>
+    <w:p>
+      <w:pPr>
+        <w:pStyle w:val="ListBullet"/>
+      </w:pPr>
+      <w:r>
+        <w:t>2023: 0.00</w:t>
+      </w:r>
+    </w:p>
+    <w:p>
+      <w:pPr>
+        <w:pStyle w:val="ListBullet"/>
+      </w:pPr>
+      <w:r>
+        <w:t>2024: 0.00</w:t>
       </w:r>
     </w:p>
     <w:p>
@@ -20719,15 +20895,135 @@
           <w:b/>
           <w:color w:val="FF0000"/>
         </w:rPr>
-        <w:t>2023: 0.32</w:t>
-      </w:r>
-    </w:p>
-    <w:p>
-      <w:pPr>
-        <w:pStyle w:val="ListBullet"/>
-      </w:pPr>
-      <w:r>
-        <w:t>2024: 0.11</w:t>
+        <w:t>2025: 1.00</w:t>
+      </w:r>
+    </w:p>
+    <w:p>
+      <w:r>
+        <w:rPr>
+          <w:sz w:val="26"/>
+        </w:rPr>
+        <w:t>J.T. Miller: 13</w:t>
+      </w:r>
+    </w:p>
+    <w:p>
+      <w:pPr>
+        <w:pStyle w:val="ListBullet"/>
+      </w:pPr>
+      <w:r>
+        <w:t>2022: 0.00</w:t>
+      </w:r>
+    </w:p>
+    <w:p>
+      <w:pPr>
+        <w:pStyle w:val="ListBullet"/>
+      </w:pPr>
+      <w:r>
+        <w:t>2023: 0.00</w:t>
+      </w:r>
+    </w:p>
+    <w:p>
+      <w:pPr>
+        <w:pStyle w:val="ListBullet"/>
+      </w:pPr>
+      <w:r>
+        <w:t>2024: 0.00</w:t>
+      </w:r>
+    </w:p>
+    <w:p>
+      <w:pPr>
+        <w:pStyle w:val="ListBullet"/>
+      </w:pPr>
+      <w:r>
+        <w:t>2025: 0.00</w:t>
+      </w:r>
+    </w:p>
+    <w:p>
+      <w:r>
+        <w:rPr>
+          <w:sz w:val="26"/>
+        </w:rPr>
+        <w:t>Jonny Brodzinski: 19</w:t>
+      </w:r>
+    </w:p>
+    <w:p>
+      <w:pPr>
+        <w:pStyle w:val="ListBullet"/>
+      </w:pPr>
+      <w:r>
+        <w:t>2022: 0.00</w:t>
+      </w:r>
+    </w:p>
+    <w:p>
+      <w:pPr>
+        <w:pStyle w:val="ListBullet"/>
+      </w:pPr>
+      <w:r>
+        <w:t>2023: 0.00</w:t>
+      </w:r>
+    </w:p>
+    <w:p>
+      <w:pPr>
+        <w:pStyle w:val="ListBullet"/>
+      </w:pPr>
+      <w:r>
+        <w:t>2024: 0.00</w:t>
+      </w:r>
+    </w:p>
+    <w:p>
+      <w:pPr>
+        <w:pStyle w:val="ListBullet"/>
+      </w:pPr>
+      <w:r>
+        <w:t>2025: 0.00</w:t>
+      </w:r>
+    </w:p>
+    <w:p>
+      <w:r>
+        <w:rPr>
+          <w:sz w:val="26"/>
+        </w:rPr>
+        <w:t>Matthew Robertson: 18</w:t>
+      </w:r>
+    </w:p>
+    <w:p>
+      <w:pPr>
+        <w:pStyle w:val="ListBullet"/>
+      </w:pPr>
+      <w:r>
+        <w:t>2022: 0.00</w:t>
+      </w:r>
+    </w:p>
+    <w:p>
+      <w:pPr>
+        <w:pStyle w:val="ListBullet"/>
+      </w:pPr>
+      <w:r>
+        <w:t>2023: 0.00</w:t>
+      </w:r>
+    </w:p>
+    <w:p>
+      <w:pPr>
+        <w:pStyle w:val="ListBullet"/>
+      </w:pPr>
+      <w:r>
+        <w:t>2024: 0.00</w:t>
+      </w:r>
+    </w:p>
+    <w:p>
+      <w:pPr>
+        <w:pStyle w:val="ListBullet"/>
+      </w:pPr>
+      <w:r>
+        <w:t>2025: 0.00</w:t>
+      </w:r>
+    </w:p>
+    <w:p>
+      <w:r>
+        <w:rPr>
+          <w:sz w:val="26"/>
+        </w:rPr>
+        <w:t>Conor Sheary: 0</w:t>
       </w:r>
     </w:p>
     <w:p>
@@ -20739,55 +21035,7 @@
           <w:b/>
           <w:color w:val="FF0000"/>
         </w:rPr>
-        <w:t>2025: 0.26</w:t>
-      </w:r>
-    </w:p>
-    <w:p>
-      <w:r>
-        <w:rPr>
-          <w:sz w:val="26"/>
-        </w:rPr>
-        <w:t>Matt Rempe: 23</w:t>
-      </w:r>
-    </w:p>
-    <w:p>
-      <w:pPr>
-        <w:pStyle w:val="ListBullet"/>
-      </w:pPr>
-      <w:r>
-        <w:t>2022: 0.00</w:t>
-      </w:r>
-    </w:p>
-    <w:p>
-      <w:pPr>
-        <w:pStyle w:val="ListBullet"/>
-      </w:pPr>
-      <w:r>
-        <w:t>2023: 0.00</w:t>
-      </w:r>
-    </w:p>
-    <w:p>
-      <w:pPr>
-        <w:pStyle w:val="ListBullet"/>
-      </w:pPr>
-      <w:r>
-        <w:t>2024: 0.00</w:t>
-      </w:r>
-    </w:p>
-    <w:p>
-      <w:pPr>
-        <w:pStyle w:val="ListBullet"/>
-      </w:pPr>
-      <w:r>
-        <w:t>2025: 0.00</w:t>
-      </w:r>
-    </w:p>
-    <w:p>
-      <w:r>
-        <w:rPr>
-          <w:sz w:val="26"/>
-        </w:rPr>
-        <w:t>Will Borgen: 8</w:t>
+        <w:t>2022: 0.29</w:t>
       </w:r>
     </w:p>
     <w:p>
@@ -20799,15 +21047,79 @@
           <w:b/>
           <w:color w:val="FF0000"/>
         </w:rPr>
-        <w:t>2022: 0.50</w:t>
-      </w:r>
-    </w:p>
-    <w:p>
-      <w:pPr>
-        <w:pStyle w:val="ListBullet"/>
-      </w:pPr>
-      <w:r>
-        <w:t>2023: 0.00</w:t>
+        <w:t>2023: 0.33</w:t>
+      </w:r>
+    </w:p>
+    <w:p>
+      <w:pPr>
+        <w:pStyle w:val="ListBullet"/>
+      </w:pPr>
+      <w:r>
+        <w:t>2024: 0.00</w:t>
+      </w:r>
+    </w:p>
+    <w:p>
+      <w:pPr>
+        <w:pStyle w:val="ListBullet"/>
+      </w:pPr>
+      <w:r>
+        <w:t>2025: 0.00</w:t>
+      </w:r>
+    </w:p>
+    <w:p>
+      <w:r>
+        <w:rPr>
+          <w:sz w:val="26"/>
+        </w:rPr>
+        <w:t>Scott Morrow: 37</w:t>
+      </w:r>
+    </w:p>
+    <w:p>
+      <w:pPr>
+        <w:pStyle w:val="ListBullet"/>
+      </w:pPr>
+      <w:r>
+        <w:t>2022: 0.00</w:t>
+      </w:r>
+    </w:p>
+    <w:p>
+      <w:pPr>
+        <w:pStyle w:val="ListBullet"/>
+      </w:pPr>
+      <w:r>
+        <w:t>2023: 0.00</w:t>
+      </w:r>
+    </w:p>
+    <w:p>
+      <w:pPr>
+        <w:pStyle w:val="ListBullet"/>
+      </w:pPr>
+      <w:r>
+        <w:t>2024: 0.00</w:t>
+      </w:r>
+    </w:p>
+    <w:p>
+      <w:pPr>
+        <w:pStyle w:val="ListBullet"/>
+      </w:pPr>
+      <w:r>
+        <w:t>2025: 0.00</w:t>
+      </w:r>
+    </w:p>
+    <w:p>
+      <w:r>
+        <w:rPr>
+          <w:sz w:val="26"/>
+        </w:rPr>
+        <w:t>Adam Edstrom: 6</w:t>
+      </w:r>
+    </w:p>
+    <w:p>
+      <w:pPr>
+        <w:pStyle w:val="ListBullet"/>
+      </w:pPr>
+      <w:r>
+        <w:t>2022: 0.00</w:t>
       </w:r>
     </w:p>
     <w:p>
@@ -20819,7 +21131,15 @@
           <w:b/>
           <w:color w:val="FF0000"/>
         </w:rPr>
-        <w:t>2024: 0.25</w:t>
+        <w:t>2023: 1.00</w:t>
+      </w:r>
+    </w:p>
+    <w:p>
+      <w:pPr>
+        <w:pStyle w:val="ListBullet"/>
+      </w:pPr>
+      <w:r>
+        <w:t>2024: 0.00</w:t>
       </w:r>
     </w:p>
     <w:p>
@@ -20835,23 +21155,7 @@
         <w:rPr>
           <w:sz w:val="26"/>
         </w:rPr>
-        <w:t>Alexis Lafrenire: 1</w:t>
-      </w:r>
-    </w:p>
-    <w:p>
-      <w:pPr>
-        <w:pStyle w:val="ListBullet"/>
-      </w:pPr>
-      <w:r>
-        <w:t>2022: 0.00</w:t>
-      </w:r>
-    </w:p>
-    <w:p>
-      <w:pPr>
-        <w:pStyle w:val="ListBullet"/>
-      </w:pPr>
-      <w:r>
-        <w:t>2023: 0.18</w:t>
+        <w:t>Vincent Trocheck: 2</w:t>
       </w:r>
     </w:p>
     <w:p>
@@ -20863,7 +21167,7 @@
           <w:b/>
           <w:color w:val="FF0000"/>
         </w:rPr>
-        <w:t>2024: 0.33</w:t>
+        <w:t>2022: 0.26</w:t>
       </w:r>
     </w:p>
     <w:p>
@@ -20875,295 +21179,15 @@
           <w:b/>
           <w:color w:val="FF0000"/>
         </w:rPr>
-        <w:t>2025: 0.25</w:t>
-      </w:r>
-    </w:p>
-    <w:p>
-      <w:r>
-        <w:rPr>
-          <w:sz w:val="26"/>
-        </w:rPr>
-        <w:t>Braden Schneider: 28</w:t>
-      </w:r>
-    </w:p>
-    <w:p>
-      <w:pPr>
-        <w:pStyle w:val="ListBullet"/>
-      </w:pPr>
-      <w:r>
-        <w:t>2022: 0.00</w:t>
-      </w:r>
-    </w:p>
-    <w:p>
-      <w:pPr>
-        <w:pStyle w:val="ListBullet"/>
-      </w:pPr>
-      <w:r>
-        <w:t>2023: 0.00</w:t>
-      </w:r>
-    </w:p>
-    <w:p>
-      <w:pPr>
-        <w:pStyle w:val="ListBullet"/>
-      </w:pPr>
-      <w:r>
-        <w:t>2024: 0.00</w:t>
-      </w:r>
-    </w:p>
-    <w:p>
-      <w:pPr>
-        <w:pStyle w:val="ListBullet"/>
-      </w:pPr>
-      <w:r>
-        <w:t>2025: 0.00</w:t>
-      </w:r>
-    </w:p>
-    <w:p>
-      <w:r>
-        <w:rPr>
-          <w:sz w:val="26"/>
-        </w:rPr>
-        <w:t>J.T. Miller: 12</w:t>
-      </w:r>
-    </w:p>
-    <w:p>
-      <w:pPr>
-        <w:pStyle w:val="ListBullet"/>
-      </w:pPr>
-      <w:r>
-        <w:t>2022: 0.00</w:t>
-      </w:r>
-    </w:p>
-    <w:p>
-      <w:pPr>
-        <w:pStyle w:val="ListBullet"/>
-      </w:pPr>
-      <w:r>
-        <w:t>2023: 0.00</w:t>
-      </w:r>
-    </w:p>
-    <w:p>
-      <w:pPr>
-        <w:pStyle w:val="ListBullet"/>
-      </w:pPr>
-      <w:r>
-        <w:t>2024: 0.06</w:t>
-      </w:r>
-    </w:p>
-    <w:p>
-      <w:pPr>
-        <w:pStyle w:val="ListBullet"/>
-      </w:pPr>
-      <w:r>
-        <w:t>2025: 0.00</w:t>
-      </w:r>
-    </w:p>
-    <w:p>
-      <w:r>
-        <w:rPr>
-          <w:sz w:val="26"/>
-        </w:rPr>
-        <w:t>Jonny Brodzinski: 19</w:t>
-      </w:r>
-    </w:p>
-    <w:p>
-      <w:pPr>
-        <w:pStyle w:val="ListBullet"/>
-      </w:pPr>
-      <w:r>
-        <w:t>2022: 0.00</w:t>
-      </w:r>
-    </w:p>
-    <w:p>
-      <w:pPr>
-        <w:pStyle w:val="ListBullet"/>
-      </w:pPr>
-      <w:r>
-        <w:t>2023: 0.00</w:t>
-      </w:r>
-    </w:p>
-    <w:p>
-      <w:pPr>
-        <w:pStyle w:val="ListBullet"/>
-      </w:pPr>
-      <w:r>
-        <w:t>2024: 0.00</w:t>
-      </w:r>
-    </w:p>
-    <w:p>
-      <w:pPr>
-        <w:pStyle w:val="ListBullet"/>
-      </w:pPr>
-      <w:r>
-        <w:t>2025: 0.00</w:t>
-      </w:r>
-    </w:p>
-    <w:p>
-      <w:r>
-        <w:rPr>
-          <w:sz w:val="26"/>
-        </w:rPr>
-        <w:t>Matthew Robertson: 17</w:t>
-      </w:r>
-    </w:p>
-    <w:p>
-      <w:pPr>
-        <w:pStyle w:val="ListBullet"/>
-      </w:pPr>
-      <w:r>
-        <w:t>2022: 0.00</w:t>
-      </w:r>
-    </w:p>
-    <w:p>
-      <w:pPr>
-        <w:pStyle w:val="ListBullet"/>
-      </w:pPr>
-      <w:r>
-        <w:t>2023: 0.00</w:t>
-      </w:r>
-    </w:p>
-    <w:p>
-      <w:pPr>
-        <w:pStyle w:val="ListBullet"/>
-      </w:pPr>
-      <w:r>
-        <w:t>2024: 0.00</w:t>
-      </w:r>
-    </w:p>
-    <w:p>
-      <w:pPr>
-        <w:pStyle w:val="ListBullet"/>
-      </w:pPr>
-      <w:r>
-        <w:t>2025: 0.00</w:t>
-      </w:r>
-    </w:p>
-    <w:p>
-      <w:r>
-        <w:rPr>
-          <w:sz w:val="26"/>
-        </w:rPr>
-        <w:t>Conor Sheary: 2</w:t>
-      </w:r>
-    </w:p>
-    <w:p>
-      <w:pPr>
-        <w:pStyle w:val="ListBullet"/>
-      </w:pPr>
-      <w:r>
-        <w:t>2022: 0.07</w:t>
-      </w:r>
-    </w:p>
-    <w:p>
-      <w:pPr>
-        <w:pStyle w:val="ListBullet"/>
-      </w:pPr>
-      <w:r>
-        <w:t>2023: 0.00</w:t>
-      </w:r>
-    </w:p>
-    <w:p>
-      <w:pPr>
-        <w:pStyle w:val="ListBullet"/>
-      </w:pPr>
-      <w:r>
-        <w:t>2024: 0.00</w:t>
-      </w:r>
-    </w:p>
-    <w:p>
-      <w:pPr>
-        <w:pStyle w:val="ListBullet"/>
-      </w:pPr>
-      <w:r>
-        <w:t>2025: 0.00</w:t>
-      </w:r>
-    </w:p>
-    <w:p>
-      <w:r>
-        <w:rPr>
-          <w:sz w:val="26"/>
-        </w:rPr>
-        <w:t>Scott Morrow: 37</w:t>
-      </w:r>
-    </w:p>
-    <w:p>
-      <w:pPr>
-        <w:pStyle w:val="ListBullet"/>
-      </w:pPr>
-      <w:r>
-        <w:t>2022: 0.00</w:t>
-      </w:r>
-    </w:p>
-    <w:p>
-      <w:pPr>
-        <w:pStyle w:val="ListBullet"/>
-      </w:pPr>
-      <w:r>
-        <w:t>2023: 0.00</w:t>
-      </w:r>
-    </w:p>
-    <w:p>
-      <w:pPr>
-        <w:pStyle w:val="ListBullet"/>
-      </w:pPr>
-      <w:r>
-        <w:t>2024: 0.00</w:t>
-      </w:r>
-    </w:p>
-    <w:p>
-      <w:pPr>
-        <w:pStyle w:val="ListBullet"/>
-      </w:pPr>
-      <w:r>
-        <w:t>2025: 0.00</w:t>
-      </w:r>
-    </w:p>
-    <w:p>
-      <w:r>
-        <w:rPr>
-          <w:sz w:val="26"/>
-        </w:rPr>
-        <w:t>Adam Edstrom: 5</w:t>
-      </w:r>
-    </w:p>
-    <w:p>
-      <w:pPr>
-        <w:pStyle w:val="ListBullet"/>
-      </w:pPr>
-      <w:r>
-        <w:t>2022: 0.00</w:t>
-      </w:r>
-    </w:p>
-    <w:p>
-      <w:pPr>
-        <w:pStyle w:val="ListBullet"/>
-      </w:pPr>
-      <w:r>
-        <w:t>2023: 0.00</w:t>
-      </w:r>
-    </w:p>
-    <w:p>
-      <w:pPr>
-        <w:pStyle w:val="ListBullet"/>
-      </w:pPr>
-      <w:r>
-        <w:t>2024: 0.00</w:t>
-      </w:r>
-    </w:p>
-    <w:p>
-      <w:pPr>
-        <w:pStyle w:val="ListBullet"/>
-      </w:pPr>
-      <w:r>
-        <w:t>2025: 0.00</w:t>
-      </w:r>
-    </w:p>
-    <w:p>
-      <w:r>
-        <w:rPr>
-          <w:sz w:val="26"/>
-        </w:rPr>
-        <w:t>Vincent Trocheck: 1</w:t>
+        <w:t>2023: 0.21</w:t>
+      </w:r>
+    </w:p>
+    <w:p>
+      <w:pPr>
+        <w:pStyle w:val="ListBullet"/>
+      </w:pPr>
+      <w:r>
+        <w:t>2024: 0.13</w:t>
       </w:r>
     </w:p>
     <w:p>
@@ -21175,23 +21199,159 @@
           <w:b/>
           <w:color w:val="FF0000"/>
         </w:rPr>
-        <w:t>2022: 0.21</w:t>
-      </w:r>
-    </w:p>
-    <w:p>
-      <w:pPr>
-        <w:pStyle w:val="ListBullet"/>
-      </w:pPr>
-      <w:r>
-        <w:t>2023: 0.05</w:t>
-      </w:r>
-    </w:p>
-    <w:p>
-      <w:pPr>
-        <w:pStyle w:val="ListBullet"/>
-      </w:pPr>
-      <w:r>
-        <w:t>2024: 0.13</w:t>
+        <w:t>2025: 0.25</w:t>
+      </w:r>
+    </w:p>
+    <w:p>
+      <w:r>
+        <w:rPr>
+          <w:sz w:val="26"/>
+        </w:rPr>
+        <w:t>Anton Blidh: 19</w:t>
+      </w:r>
+    </w:p>
+    <w:p>
+      <w:pPr>
+        <w:pStyle w:val="ListBullet"/>
+      </w:pPr>
+      <w:r>
+        <w:t>2022: 0.00</w:t>
+      </w:r>
+    </w:p>
+    <w:p>
+      <w:pPr>
+        <w:pStyle w:val="ListBullet"/>
+      </w:pPr>
+      <w:r>
+        <w:t>2023: 0.00</w:t>
+      </w:r>
+    </w:p>
+    <w:p>
+      <w:pPr>
+        <w:pStyle w:val="ListBullet"/>
+      </w:pPr>
+      <w:r>
+        <w:t>2024: 0.00</w:t>
+      </w:r>
+    </w:p>
+    <w:p>
+      <w:pPr>
+        <w:pStyle w:val="ListBullet"/>
+      </w:pPr>
+      <w:r>
+        <w:t>2025: 0.00</w:t>
+      </w:r>
+    </w:p>
+    <w:p>
+      <w:r>
+        <w:rPr>
+          <w:sz w:val="26"/>
+        </w:rPr>
+        <w:t>Vincent Iorio: 35</w:t>
+      </w:r>
+    </w:p>
+    <w:p>
+      <w:pPr>
+        <w:pStyle w:val="ListBullet"/>
+      </w:pPr>
+      <w:r>
+        <w:t>2022: 0.00</w:t>
+      </w:r>
+    </w:p>
+    <w:p>
+      <w:pPr>
+        <w:pStyle w:val="ListBullet"/>
+      </w:pPr>
+      <w:r>
+        <w:t>2023: 0.00</w:t>
+      </w:r>
+    </w:p>
+    <w:p>
+      <w:pPr>
+        <w:pStyle w:val="ListBullet"/>
+      </w:pPr>
+      <w:r>
+        <w:t>2024: 0.00</w:t>
+      </w:r>
+    </w:p>
+    <w:p>
+      <w:pPr>
+        <w:pStyle w:val="ListBullet"/>
+      </w:pPr>
+      <w:r>
+        <w:t>2025: 0.00</w:t>
+      </w:r>
+    </w:p>
+    <w:p>
+      <w:r>
+        <w:rPr>
+          <w:sz w:val="26"/>
+        </w:rPr>
+        <w:t>Adam Fox: 6</w:t>
+      </w:r>
+    </w:p>
+    <w:p>
+      <w:pPr>
+        <w:pStyle w:val="ListBullet"/>
+      </w:pPr>
+      <w:r>
+        <w:t>2022: 0.00</w:t>
+      </w:r>
+    </w:p>
+    <w:p>
+      <w:pPr>
+        <w:pStyle w:val="ListBullet"/>
+      </w:pPr>
+      <w:r>
+        <w:t>2023: 0.07</w:t>
+      </w:r>
+    </w:p>
+    <w:p>
+      <w:pPr>
+        <w:pStyle w:val="ListBullet"/>
+      </w:pPr>
+      <w:r>
+        <w:t>2024: 0.12</w:t>
+      </w:r>
+    </w:p>
+    <w:p>
+      <w:pPr>
+        <w:pStyle w:val="ListBullet"/>
+      </w:pPr>
+      <w:r>
+        <w:t>2025: 0.00</w:t>
+      </w:r>
+    </w:p>
+    <w:p>
+      <w:r>
+        <w:rPr>
+          <w:sz w:val="26"/>
+        </w:rPr>
+        <w:t>Tye Kartye: 1</w:t>
+      </w:r>
+    </w:p>
+    <w:p>
+      <w:pPr>
+        <w:pStyle w:val="ListBullet"/>
+      </w:pPr>
+      <w:r>
+        <w:t>2022: 0.00</w:t>
+      </w:r>
+    </w:p>
+    <w:p>
+      <w:pPr>
+        <w:pStyle w:val="ListBullet"/>
+      </w:pPr>
+      <w:r>
+        <w:t>2023: 0.10</w:t>
+      </w:r>
+    </w:p>
+    <w:p>
+      <w:pPr>
+        <w:pStyle w:val="ListBullet"/>
+      </w:pPr>
+      <w:r>
+        <w:t>2024: 0.00</w:t>
       </w:r>
     </w:p>
     <w:p>
@@ -21203,15 +21363,63 @@
           <w:b/>
           <w:color w:val="FF0000"/>
         </w:rPr>
-        <w:t>2025: 0.25</w:t>
-      </w:r>
-    </w:p>
-    <w:p>
-      <w:r>
-        <w:rPr>
-          <w:sz w:val="26"/>
-        </w:rPr>
-        <w:t>Anton Blidh: 19</w:t>
+        <w:t>2025: 0.20</w:t>
+      </w:r>
+    </w:p>
+    <w:p>
+      <w:pPr>
+        <w:pStyle w:val="Heading2"/>
+      </w:pPr>
+      <w:r>
+        <w:t>Team: OTT</w:t>
+      </w:r>
+    </w:p>
+    <w:p>
+      <w:r>
+        <w:rPr>
+          <w:sz w:val="26"/>
+        </w:rPr>
+        <w:t>Fabian Zetterlund: 4</w:t>
+      </w:r>
+    </w:p>
+    <w:p>
+      <w:pPr>
+        <w:pStyle w:val="ListBullet"/>
+      </w:pPr>
+      <w:r>
+        <w:t>2022: 0.00</w:t>
+      </w:r>
+    </w:p>
+    <w:p>
+      <w:pPr>
+        <w:pStyle w:val="ListBullet"/>
+      </w:pPr>
+      <w:r>
+        <w:t>2023: 0.05</w:t>
+      </w:r>
+    </w:p>
+    <w:p>
+      <w:pPr>
+        <w:pStyle w:val="ListBullet"/>
+      </w:pPr>
+      <w:r>
+        <w:t>2024: 0.18</w:t>
+      </w:r>
+    </w:p>
+    <w:p>
+      <w:pPr>
+        <w:pStyle w:val="ListBullet"/>
+      </w:pPr>
+      <w:r>
+        <w:t>2025: 0.09</w:t>
+      </w:r>
+    </w:p>
+    <w:p>
+      <w:r>
+        <w:rPr>
+          <w:sz w:val="26"/>
+        </w:rPr>
+        <w:t>Olle Lycksell: 3</w:t>
       </w:r>
     </w:p>
     <w:p>
@@ -21251,7 +21459,7 @@
         <w:rPr>
           <w:sz w:val="26"/>
         </w:rPr>
-        <w:t>Vincent Iorio: 35</w:t>
+        <w:t>Jordan Spence: 18</w:t>
       </w:r>
     </w:p>
     <w:p>
@@ -21291,23 +21499,47 @@
         <w:rPr>
           <w:sz w:val="26"/>
         </w:rPr>
-        <w:t>Adam Fox: 5</w:t>
-      </w:r>
-    </w:p>
-    <w:p>
-      <w:pPr>
-        <w:pStyle w:val="ListBullet"/>
-      </w:pPr>
-      <w:r>
-        <w:t>2022: 0.00</w:t>
-      </w:r>
-    </w:p>
-    <w:p>
-      <w:pPr>
-        <w:pStyle w:val="ListBullet"/>
-      </w:pPr>
-      <w:r>
-        <w:t>2023: 0.07</w:t>
+        <w:t>Nick Jensen: 12</w:t>
+      </w:r>
+    </w:p>
+    <w:p>
+      <w:pPr>
+        <w:pStyle w:val="ListBullet"/>
+      </w:pPr>
+      <w:r>
+        <w:t>2022: 0.00</w:t>
+      </w:r>
+    </w:p>
+    <w:p>
+      <w:pPr>
+        <w:pStyle w:val="ListBullet"/>
+      </w:pPr>
+      <w:r>
+        <w:t>2023: 0.00</w:t>
+      </w:r>
+    </w:p>
+    <w:p>
+      <w:pPr>
+        <w:pStyle w:val="ListBullet"/>
+      </w:pPr>
+      <w:r>
+        <w:t>2024: 0.00</w:t>
+      </w:r>
+    </w:p>
+    <w:p>
+      <w:pPr>
+        <w:pStyle w:val="ListBullet"/>
+      </w:pPr>
+      <w:r>
+        <w:t>2025: 0.00</w:t>
+      </w:r>
+    </w:p>
+    <w:p>
+      <w:r>
+        <w:rPr>
+          <w:sz w:val="26"/>
+        </w:rPr>
+        <w:t>Tim Sttzle: 1</w:t>
       </w:r>
     </w:p>
     <w:p>
@@ -21319,31 +21551,7 @@
           <w:b/>
           <w:color w:val="FF0000"/>
         </w:rPr>
-        <w:t>2024: 0.38</w:t>
-      </w:r>
-    </w:p>
-    <w:p>
-      <w:pPr>
-        <w:pStyle w:val="ListBullet"/>
-      </w:pPr>
-      <w:r>
-        <w:t>2025: 0.00</w:t>
-      </w:r>
-    </w:p>
-    <w:p>
-      <w:r>
-        <w:rPr>
-          <w:sz w:val="26"/>
-        </w:rPr>
-        <w:t>Tye Kartye: 0</w:t>
-      </w:r>
-    </w:p>
-    <w:p>
-      <w:pPr>
-        <w:pStyle w:val="ListBullet"/>
-      </w:pPr>
-      <w:r>
-        <w:t>2022: 0.00</w:t>
+        <w:t>2022: 0.30</w:t>
       </w:r>
     </w:p>
     <w:p>
@@ -21355,47 +21563,7 @@
           <w:b/>
           <w:color w:val="FF0000"/>
         </w:rPr>
-        <w:t>2023: 0.30</w:t>
-      </w:r>
-    </w:p>
-    <w:p>
-      <w:pPr>
-        <w:pStyle w:val="ListBullet"/>
-      </w:pPr>
-      <w:r>
-        <w:t>2024: 0.00</w:t>
-      </w:r>
-    </w:p>
-    <w:p>
-      <w:pPr>
-        <w:pStyle w:val="ListBullet"/>
-      </w:pPr>
-      <w:r>
-        <w:t>2025: 0.00</w:t>
-      </w:r>
-    </w:p>
-    <w:p>
-      <w:pPr>
-        <w:pStyle w:val="Heading2"/>
-      </w:pPr>
-      <w:r>
-        <w:t>Team: OTT</w:t>
-      </w:r>
-    </w:p>
-    <w:p>
-      <w:r>
-        <w:rPr>
-          <w:sz w:val="26"/>
-        </w:rPr>
-        <w:t>Fabian Zetterlund: 3</w:t>
-      </w:r>
-    </w:p>
-    <w:p>
-      <w:pPr>
-        <w:pStyle w:val="ListBullet"/>
-      </w:pPr>
-      <w:r>
-        <w:t>2022: 0.00</w:t>
+        <w:t>2023: 0.31</w:t>
       </w:r>
     </w:p>
     <w:p>
@@ -21407,151 +21575,7 @@
           <w:b/>
           <w:color w:val="FF0000"/>
         </w:rPr>
-        <w:t>2023: 0.27</w:t>
-      </w:r>
-    </w:p>
-    <w:p>
-      <w:pPr>
-        <w:pStyle w:val="ListBullet"/>
-      </w:pPr>
-      <w:r>
-        <w:t>2024: 0.06</w:t>
-      </w:r>
-    </w:p>
-    <w:p>
-      <w:pPr>
-        <w:pStyle w:val="ListBullet"/>
-      </w:pPr>
-      <w:r>
-        <w:t>2025: 0.09</w:t>
-      </w:r>
-    </w:p>
-    <w:p>
-      <w:r>
-        <w:rPr>
-          <w:sz w:val="26"/>
-        </w:rPr>
-        <w:t>Olle Lycksell: 3</w:t>
-      </w:r>
-    </w:p>
-    <w:p>
-      <w:pPr>
-        <w:pStyle w:val="ListBullet"/>
-      </w:pPr>
-      <w:r>
-        <w:t>2022: 0.00</w:t>
-      </w:r>
-    </w:p>
-    <w:p>
-      <w:pPr>
-        <w:pStyle w:val="ListBullet"/>
-      </w:pPr>
-      <w:r>
-        <w:t>2023: 0.00</w:t>
-      </w:r>
-    </w:p>
-    <w:p>
-      <w:pPr>
-        <w:pStyle w:val="ListBullet"/>
-      </w:pPr>
-      <w:r>
-        <w:t>2024: 0.00</w:t>
-      </w:r>
-    </w:p>
-    <w:p>
-      <w:pPr>
-        <w:pStyle w:val="ListBullet"/>
-      </w:pPr>
-      <w:r>
-        <w:t>2025: 0.00</w:t>
-      </w:r>
-    </w:p>
-    <w:p>
-      <w:r>
-        <w:rPr>
-          <w:sz w:val="26"/>
-        </w:rPr>
-        <w:t>Jordan Spence: 17</w:t>
-      </w:r>
-    </w:p>
-    <w:p>
-      <w:pPr>
-        <w:pStyle w:val="ListBullet"/>
-      </w:pPr>
-      <w:r>
-        <w:t>2022: 0.00</w:t>
-      </w:r>
-    </w:p>
-    <w:p>
-      <w:pPr>
-        <w:pStyle w:val="ListBullet"/>
-      </w:pPr>
-      <w:r>
-        <w:t>2023: 0.00</w:t>
-      </w:r>
-    </w:p>
-    <w:p>
-      <w:pPr>
-        <w:pStyle w:val="ListBullet"/>
-      </w:pPr>
-      <w:r>
-        <w:t>2024: 0.00</w:t>
-      </w:r>
-    </w:p>
-    <w:p>
-      <w:pPr>
-        <w:pStyle w:val="ListBullet"/>
-      </w:pPr>
-      <w:r>
-        <w:t>2025: 0.00</w:t>
-      </w:r>
-    </w:p>
-    <w:p>
-      <w:r>
-        <w:rPr>
-          <w:sz w:val="26"/>
-        </w:rPr>
-        <w:t>Nick Jensen: 12</w:t>
-      </w:r>
-    </w:p>
-    <w:p>
-      <w:pPr>
-        <w:pStyle w:val="ListBullet"/>
-      </w:pPr>
-      <w:r>
-        <w:t>2022: 0.00</w:t>
-      </w:r>
-    </w:p>
-    <w:p>
-      <w:pPr>
-        <w:pStyle w:val="ListBullet"/>
-      </w:pPr>
-      <w:r>
-        <w:t>2023: 0.00</w:t>
-      </w:r>
-    </w:p>
-    <w:p>
-      <w:pPr>
-        <w:pStyle w:val="ListBullet"/>
-      </w:pPr>
-      <w:r>
-        <w:t>2024: 0.00</w:t>
-      </w:r>
-    </w:p>
-    <w:p>
-      <w:pPr>
-        <w:pStyle w:val="ListBullet"/>
-      </w:pPr>
-      <w:r>
-        <w:t>2025: 0.00</w:t>
-      </w:r>
-    </w:p>
-    <w:p>
-      <w:r>
-        <w:rPr>
-          <w:sz w:val="26"/>
-        </w:rPr>
-        <w:t>Tim Sttzle: 0</w:t>
+        <w:t>2024: 0.25</w:t>
       </w:r>
     </w:p>
     <w:p>
@@ -21563,7 +21587,103 @@
           <w:b/>
           <w:color w:val="FF0000"/>
         </w:rPr>
-        <w:t>2022: 0.40</w:t>
+        <w:t>2025: 0.26</w:t>
+      </w:r>
+    </w:p>
+    <w:p>
+      <w:r>
+        <w:rPr>
+          <w:sz w:val="26"/>
+        </w:rPr>
+        <w:t>Drake Batherson: 4</w:t>
+      </w:r>
+    </w:p>
+    <w:p>
+      <w:pPr>
+        <w:pStyle w:val="ListBullet"/>
+      </w:pPr>
+      <w:r>
+        <w:t>2022: 0.05</w:t>
+      </w:r>
+    </w:p>
+    <w:p>
+      <w:pPr>
+        <w:pStyle w:val="ListBullet"/>
+      </w:pPr>
+      <w:r>
+        <w:t>2023: 0.08</w:t>
+      </w:r>
+    </w:p>
+    <w:p>
+      <w:pPr>
+        <w:pStyle w:val="ListBullet"/>
+      </w:pPr>
+      <w:r>
+        <w:t>2024: 0.00</w:t>
+      </w:r>
+    </w:p>
+    <w:p>
+      <w:pPr>
+        <w:pStyle w:val="ListBullet"/>
+      </w:pPr>
+      <w:r>
+        <w:t>2025: 0.05</w:t>
+      </w:r>
+    </w:p>
+    <w:p>
+      <w:r>
+        <w:rPr>
+          <w:sz w:val="26"/>
+        </w:rPr>
+        <w:t>Kurtis MacDermid: 79</w:t>
+      </w:r>
+    </w:p>
+    <w:p>
+      <w:pPr>
+        <w:pStyle w:val="ListBullet"/>
+      </w:pPr>
+      <w:r>
+        <w:t>2022: 0.00</w:t>
+      </w:r>
+    </w:p>
+    <w:p>
+      <w:pPr>
+        <w:pStyle w:val="ListBullet"/>
+      </w:pPr>
+      <w:r>
+        <w:t>2023: 0.00</w:t>
+      </w:r>
+    </w:p>
+    <w:p>
+      <w:pPr>
+        <w:pStyle w:val="ListBullet"/>
+      </w:pPr>
+      <w:r>
+        <w:t>2024: 0.00</w:t>
+      </w:r>
+    </w:p>
+    <w:p>
+      <w:pPr>
+        <w:pStyle w:val="ListBullet"/>
+      </w:pPr>
+      <w:r>
+        <w:t>2025: 0.00</w:t>
+      </w:r>
+    </w:p>
+    <w:p>
+      <w:r>
+        <w:rPr>
+          <w:sz w:val="26"/>
+        </w:rPr>
+        <w:t>Thomas Chabot: 5</w:t>
+      </w:r>
+    </w:p>
+    <w:p>
+      <w:pPr>
+        <w:pStyle w:val="ListBullet"/>
+      </w:pPr>
+      <w:r>
+        <w:t>2022: 0.00</w:t>
       </w:r>
     </w:p>
     <w:p>
@@ -21579,7 +21699,7 @@
         <w:pStyle w:val="ListBullet"/>
       </w:pPr>
       <w:r>
-        <w:t>2024: 0.10</w:t>
+        <w:t>2024: 0.00</w:t>
       </w:r>
     </w:p>
     <w:p>
@@ -21591,55 +21711,15 @@
           <w:b/>
           <w:color w:val="FF0000"/>
         </w:rPr>
-        <w:t>2025: 0.44</w:t>
-      </w:r>
-    </w:p>
-    <w:p>
-      <w:r>
-        <w:rPr>
-          <w:sz w:val="26"/>
-        </w:rPr>
-        <w:t>Drake Batherson: 3</w:t>
-      </w:r>
-    </w:p>
-    <w:p>
-      <w:pPr>
-        <w:pStyle w:val="ListBullet"/>
-      </w:pPr>
-      <w:r>
-        <w:t>2022: 0.11</w:t>
-      </w:r>
-    </w:p>
-    <w:p>
-      <w:pPr>
-        <w:pStyle w:val="ListBullet"/>
-      </w:pPr>
-      <w:r>
-        <w:t>2023: 0.00</w:t>
-      </w:r>
-    </w:p>
-    <w:p>
-      <w:pPr>
-        <w:pStyle w:val="ListBullet"/>
-      </w:pPr>
-      <w:r>
-        <w:t>2024: 0.05</w:t>
-      </w:r>
-    </w:p>
-    <w:p>
-      <w:pPr>
-        <w:pStyle w:val="ListBullet"/>
-      </w:pPr>
-      <w:r>
-        <w:t>2025: 0.16</w:t>
-      </w:r>
-    </w:p>
-    <w:p>
-      <w:r>
-        <w:rPr>
-          <w:sz w:val="26"/>
-        </w:rPr>
-        <w:t>Kurtis MacDermid: 79</w:t>
+        <w:t>2025: 0.40</w:t>
+      </w:r>
+    </w:p>
+    <w:p>
+      <w:r>
+        <w:rPr>
+          <w:sz w:val="26"/>
+        </w:rPr>
+        <w:t>Hayden Hodgson: 12</w:t>
       </w:r>
     </w:p>
     <w:p>
@@ -21679,95 +21759,7 @@
         <w:rPr>
           <w:sz w:val="26"/>
         </w:rPr>
-        <w:t>Thomas Chabot: 4</w:t>
-      </w:r>
-    </w:p>
-    <w:p>
-      <w:pPr>
-        <w:pStyle w:val="ListBullet"/>
-      </w:pPr>
-      <w:r>
-        <w:t>2022: 0.10</w:t>
-      </w:r>
-    </w:p>
-    <w:p>
-      <w:pPr>
-        <w:pStyle w:val="ListBullet"/>
-      </w:pPr>
-      <w:r>
-        <w:t>2023: 0.00</w:t>
-      </w:r>
-    </w:p>
-    <w:p>
-      <w:pPr>
-        <w:pStyle w:val="ListBullet"/>
-      </w:pPr>
-      <w:r>
-        <w:t>2024: 0.00</w:t>
-      </w:r>
-    </w:p>
-    <w:p>
-      <w:pPr>
-        <w:pStyle w:val="ListBullet"/>
-      </w:pPr>
-      <w:r>
-        <w:t>2025: 0.00</w:t>
-      </w:r>
-    </w:p>
-    <w:p>
-      <w:r>
-        <w:rPr>
-          <w:sz w:val="26"/>
-        </w:rPr>
-        <w:t>Hayden Hodgson: 12</w:t>
-      </w:r>
-    </w:p>
-    <w:p>
-      <w:pPr>
-        <w:pStyle w:val="ListBullet"/>
-      </w:pPr>
-      <w:r>
-        <w:t>2022: 0.00</w:t>
-      </w:r>
-    </w:p>
-    <w:p>
-      <w:pPr>
-        <w:pStyle w:val="ListBullet"/>
-      </w:pPr>
-      <w:r>
-        <w:t>2023: 0.00</w:t>
-      </w:r>
-    </w:p>
-    <w:p>
-      <w:pPr>
-        <w:pStyle w:val="ListBullet"/>
-      </w:pPr>
-      <w:r>
-        <w:t>2024: 0.00</w:t>
-      </w:r>
-    </w:p>
-    <w:p>
-      <w:pPr>
-        <w:pStyle w:val="ListBullet"/>
-      </w:pPr>
-      <w:r>
-        <w:t>2025: 0.00</w:t>
-      </w:r>
-    </w:p>
-    <w:p>
-      <w:r>
-        <w:rPr>
-          <w:sz w:val="26"/>
-        </w:rPr>
-        <w:t>Shane Pinto: 1</w:t>
-      </w:r>
-    </w:p>
-    <w:p>
-      <w:pPr>
-        <w:pStyle w:val="ListBullet"/>
-      </w:pPr>
-      <w:r>
-        <w:t>2022: 0.06</w:t>
+        <w:t>Shane Pinto: 0</w:t>
       </w:r>
     </w:p>
     <w:p>
@@ -21779,7 +21771,23 @@
           <w:b/>
           <w:color w:val="FF0000"/>
         </w:rPr>
-        <w:t>2023: 0.25</w:t>
+        <w:t>2022: 0.33</w:t>
+      </w:r>
+    </w:p>
+    <w:p>
+      <w:pPr>
+        <w:pStyle w:val="ListBullet"/>
+      </w:pPr>
+      <w:r>
+        <w:t>2023: 0.12</w:t>
+      </w:r>
+    </w:p>
+    <w:p>
+      <w:pPr>
+        <w:pStyle w:val="ListBullet"/>
+      </w:pPr>
+      <w:r>
+        <w:t>2024: 0.13</w:t>
       </w:r>
     </w:p>
     <w:p>
@@ -21791,23 +21799,15 @@
           <w:b/>
           <w:color w:val="FF0000"/>
         </w:rPr>
-        <w:t>2024: 0.47</w:t>
-      </w:r>
-    </w:p>
-    <w:p>
-      <w:pPr>
-        <w:pStyle w:val="ListBullet"/>
-      </w:pPr>
-      <w:r>
-        <w:t>2025: 0.13</w:t>
-      </w:r>
-    </w:p>
-    <w:p>
-      <w:r>
-        <w:rPr>
-          <w:sz w:val="26"/>
-        </w:rPr>
-        <w:t>Nikolas Matinpalo: 41</w:t>
+        <w:t>2025: 0.31</w:t>
+      </w:r>
+    </w:p>
+    <w:p>
+      <w:r>
+        <w:rPr>
+          <w:sz w:val="26"/>
+        </w:rPr>
+        <w:t>Nikolas Matinpalo: 42</w:t>
       </w:r>
     </w:p>
     <w:p>
@@ -21847,7 +21847,7 @@
         <w:rPr>
           <w:sz w:val="26"/>
         </w:rPr>
-        <w:t>Michael Amadio: 0</w:t>
+        <w:t>Michael Amadio: 1</w:t>
       </w:r>
     </w:p>
     <w:p>
@@ -21859,15 +21859,15 @@
           <w:b/>
           <w:color w:val="FF0000"/>
         </w:rPr>
-        <w:t>2022: 0.29</w:t>
-      </w:r>
-    </w:p>
-    <w:p>
-      <w:pPr>
-        <w:pStyle w:val="ListBullet"/>
-      </w:pPr>
-      <w:r>
-        <w:t>2023: 0.15</w:t>
+        <w:t>2022: 0.21</w:t>
+      </w:r>
+    </w:p>
+    <w:p>
+      <w:pPr>
+        <w:pStyle w:val="ListBullet"/>
+      </w:pPr>
+      <w:r>
+        <w:t>2023: 0.08</w:t>
       </w:r>
     </w:p>
     <w:p>
@@ -21887,27 +21887,187 @@
         <w:pStyle w:val="ListBullet"/>
       </w:pPr>
       <w:r>
+        <w:t>2025: 0.18</w:t>
+      </w:r>
+    </w:p>
+    <w:p>
+      <w:r>
+        <w:rPr>
+          <w:sz w:val="26"/>
+        </w:rPr>
+        <w:t>Nick Cousins: 13</w:t>
+      </w:r>
+    </w:p>
+    <w:p>
+      <w:pPr>
+        <w:pStyle w:val="ListBullet"/>
+      </w:pPr>
+      <w:r>
+        <w:t>2022: 0.00</w:t>
+      </w:r>
+    </w:p>
+    <w:p>
+      <w:pPr>
+        <w:pStyle w:val="ListBullet"/>
+      </w:pPr>
+      <w:r>
+        <w:t>2023: 0.00</w:t>
+      </w:r>
+    </w:p>
+    <w:p>
+      <w:pPr>
+        <w:pStyle w:val="ListBullet"/>
+      </w:pPr>
+      <w:r>
         <w:rPr>
           <w:b/>
           <w:color w:val="FF0000"/>
         </w:rPr>
-        <w:t>2025: 0.27</w:t>
-      </w:r>
-    </w:p>
-    <w:p>
-      <w:r>
-        <w:rPr>
-          <w:sz w:val="26"/>
-        </w:rPr>
-        <w:t>Nick Cousins: 12</w:t>
-      </w:r>
-    </w:p>
-    <w:p>
-      <w:pPr>
-        <w:pStyle w:val="ListBullet"/>
-      </w:pPr>
-      <w:r>
-        <w:t>2022: 0.12</w:t>
+        <w:t>2024: 0.20</w:t>
+      </w:r>
+    </w:p>
+    <w:p>
+      <w:pPr>
+        <w:pStyle w:val="ListBullet"/>
+      </w:pPr>
+      <w:r>
+        <w:t>2025: 0.00</w:t>
+      </w:r>
+    </w:p>
+    <w:p>
+      <w:r>
+        <w:rPr>
+          <w:sz w:val="26"/>
+        </w:rPr>
+        <w:t>Artem Zub: 25</w:t>
+      </w:r>
+    </w:p>
+    <w:p>
+      <w:pPr>
+        <w:pStyle w:val="ListBullet"/>
+      </w:pPr>
+      <w:r>
+        <w:t>2022: 0.00</w:t>
+      </w:r>
+    </w:p>
+    <w:p>
+      <w:pPr>
+        <w:pStyle w:val="ListBullet"/>
+      </w:pPr>
+      <w:r>
+        <w:t>2023: 0.00</w:t>
+      </w:r>
+    </w:p>
+    <w:p>
+      <w:pPr>
+        <w:pStyle w:val="ListBullet"/>
+      </w:pPr>
+      <w:r>
+        <w:t>2024: 0.00</w:t>
+      </w:r>
+    </w:p>
+    <w:p>
+      <w:pPr>
+        <w:pStyle w:val="ListBullet"/>
+      </w:pPr>
+      <w:r>
+        <w:t>2025: 0.00</w:t>
+      </w:r>
+    </w:p>
+    <w:p>
+      <w:r>
+        <w:rPr>
+          <w:sz w:val="26"/>
+        </w:rPr>
+        <w:t>Lars Eller: 9</w:t>
+      </w:r>
+    </w:p>
+    <w:p>
+      <w:pPr>
+        <w:pStyle w:val="ListBullet"/>
+      </w:pPr>
+      <w:r>
+        <w:t>2022: 0.11</w:t>
+      </w:r>
+    </w:p>
+    <w:p>
+      <w:pPr>
+        <w:pStyle w:val="ListBullet"/>
+      </w:pPr>
+      <w:r>
+        <w:t>2023: 0.00</w:t>
+      </w:r>
+    </w:p>
+    <w:p>
+      <w:pPr>
+        <w:pStyle w:val="ListBullet"/>
+      </w:pPr>
+      <w:r>
+        <w:t>2024: 0.00</w:t>
+      </w:r>
+    </w:p>
+    <w:p>
+      <w:pPr>
+        <w:pStyle w:val="ListBullet"/>
+      </w:pPr>
+      <w:r>
+        <w:t>2025: 0.00</w:t>
+      </w:r>
+    </w:p>
+    <w:p>
+      <w:r>
+        <w:rPr>
+          <w:sz w:val="26"/>
+        </w:rPr>
+        <w:t>Jake Sanderson: 6</w:t>
+      </w:r>
+    </w:p>
+    <w:p>
+      <w:pPr>
+        <w:pStyle w:val="ListBullet"/>
+      </w:pPr>
+      <w:r>
+        <w:t>2022: 0.00</w:t>
+      </w:r>
+    </w:p>
+    <w:p>
+      <w:pPr>
+        <w:pStyle w:val="ListBullet"/>
+      </w:pPr>
+      <w:r>
+        <w:t>2023: 0.00</w:t>
+      </w:r>
+    </w:p>
+    <w:p>
+      <w:pPr>
+        <w:pStyle w:val="ListBullet"/>
+      </w:pPr>
+      <w:r>
+        <w:t>2024: 0.00</w:t>
+      </w:r>
+    </w:p>
+    <w:p>
+      <w:pPr>
+        <w:pStyle w:val="ListBullet"/>
+      </w:pPr>
+      <w:r>
+        <w:t>2025: 0.10</w:t>
+      </w:r>
+    </w:p>
+    <w:p>
+      <w:r>
+        <w:rPr>
+          <w:sz w:val="26"/>
+        </w:rPr>
+        <w:t>Warren Foegele: 0</w:t>
+      </w:r>
+    </w:p>
+    <w:p>
+      <w:pPr>
+        <w:pStyle w:val="ListBullet"/>
+      </w:pPr>
+      <w:r>
+        <w:t>2022: 0.10</w:t>
       </w:r>
     </w:p>
     <w:p>
@@ -21919,159 +22079,7 @@
           <w:b/>
           <w:color w:val="FF0000"/>
         </w:rPr>
-        <w:t>2023: 0.20</w:t>
-      </w:r>
-    </w:p>
-    <w:p>
-      <w:pPr>
-        <w:pStyle w:val="ListBullet"/>
-      </w:pPr>
-      <w:r>
-        <w:t>2024: 0.00</w:t>
-      </w:r>
-    </w:p>
-    <w:p>
-      <w:pPr>
-        <w:pStyle w:val="ListBullet"/>
-      </w:pPr>
-      <w:r>
-        <w:t>2025: 0.00</w:t>
-      </w:r>
-    </w:p>
-    <w:p>
-      <w:r>
-        <w:rPr>
-          <w:sz w:val="26"/>
-        </w:rPr>
-        <w:t>Artem Zub: 24</w:t>
-      </w:r>
-    </w:p>
-    <w:p>
-      <w:pPr>
-        <w:pStyle w:val="ListBullet"/>
-      </w:pPr>
-      <w:r>
-        <w:t>2022: 0.00</w:t>
-      </w:r>
-    </w:p>
-    <w:p>
-      <w:pPr>
-        <w:pStyle w:val="ListBullet"/>
-      </w:pPr>
-      <w:r>
-        <w:t>2023: 0.00</w:t>
-      </w:r>
-    </w:p>
-    <w:p>
-      <w:pPr>
-        <w:pStyle w:val="ListBullet"/>
-      </w:pPr>
-      <w:r>
-        <w:t>2024: 0.00</w:t>
-      </w:r>
-    </w:p>
-    <w:p>
-      <w:pPr>
-        <w:pStyle w:val="ListBullet"/>
-      </w:pPr>
-      <w:r>
-        <w:t>2025: 0.00</w:t>
-      </w:r>
-    </w:p>
-    <w:p>
-      <w:r>
-        <w:rPr>
-          <w:sz w:val="26"/>
-        </w:rPr>
-        <w:t>Lars Eller: 8</w:t>
-      </w:r>
-    </w:p>
-    <w:p>
-      <w:pPr>
-        <w:pStyle w:val="ListBullet"/>
-      </w:pPr>
-      <w:r>
-        <w:t>2022: 0.00</w:t>
-      </w:r>
-    </w:p>
-    <w:p>
-      <w:pPr>
-        <w:pStyle w:val="ListBullet"/>
-      </w:pPr>
-      <w:r>
-        <w:t>2023: 0.08</w:t>
-      </w:r>
-    </w:p>
-    <w:p>
-      <w:pPr>
-        <w:pStyle w:val="ListBullet"/>
-      </w:pPr>
-      <w:r>
-        <w:t>2024: 0.00</w:t>
-      </w:r>
-    </w:p>
-    <w:p>
-      <w:pPr>
-        <w:pStyle w:val="ListBullet"/>
-      </w:pPr>
-      <w:r>
-        <w:t>2025: 0.00</w:t>
-      </w:r>
-    </w:p>
-    <w:p>
-      <w:r>
-        <w:rPr>
-          <w:sz w:val="26"/>
-        </w:rPr>
-        <w:t>Jake Sanderson: 6</w:t>
-      </w:r>
-    </w:p>
-    <w:p>
-      <w:pPr>
-        <w:pStyle w:val="ListBullet"/>
-      </w:pPr>
-      <w:r>
-        <w:t>2022: 0.00</w:t>
-      </w:r>
-    </w:p>
-    <w:p>
-      <w:pPr>
-        <w:pStyle w:val="ListBullet"/>
-      </w:pPr>
-      <w:r>
-        <w:t>2023: 0.00</w:t>
-      </w:r>
-    </w:p>
-    <w:p>
-      <w:pPr>
-        <w:pStyle w:val="ListBullet"/>
-      </w:pPr>
-      <w:r>
-        <w:t>2024: 0.00</w:t>
-      </w:r>
-    </w:p>
-    <w:p>
-      <w:pPr>
-        <w:pStyle w:val="ListBullet"/>
-      </w:pPr>
-      <w:r>
-        <w:t>2025: 0.10</w:t>
-      </w:r>
-    </w:p>
-    <w:p>
-      <w:r>
-        <w:rPr>
-          <w:sz w:val="26"/>
-        </w:rPr>
-        <w:t>Warren Foegele: 0</w:t>
-      </w:r>
-    </w:p>
-    <w:p>
-      <w:pPr>
-        <w:pStyle w:val="ListBullet"/>
-      </w:pPr>
-      <w:r>
-        <w:t>2022: 0.10</w:t>
+        <w:t>2023: 0.21</w:t>
       </w:r>
     </w:p>
     <w:p>
@@ -22083,7 +22091,7 @@
           <w:b/>
           <w:color w:val="FF0000"/>
         </w:rPr>
-        <w:t>2023: 0.21</w:t>
+        <w:t>2024: 0.29</w:t>
       </w:r>
     </w:p>
     <w:p>
@@ -22095,7 +22103,215 @@
           <w:b/>
           <w:color w:val="FF0000"/>
         </w:rPr>
-        <w:t>2024: 0.29</w:t>
+        <w:t>2025: 0.27</w:t>
+      </w:r>
+    </w:p>
+    <w:p>
+      <w:r>
+        <w:rPr>
+          <w:sz w:val="26"/>
+        </w:rPr>
+        <w:t>Claude Giroux: 1</w:t>
+      </w:r>
+    </w:p>
+    <w:p>
+      <w:pPr>
+        <w:pStyle w:val="ListBullet"/>
+      </w:pPr>
+      <w:r>
+        <w:t>2022: 0.03</w:t>
+      </w:r>
+    </w:p>
+    <w:p>
+      <w:pPr>
+        <w:pStyle w:val="ListBullet"/>
+      </w:pPr>
+      <w:r>
+        <w:t>2023: 0.11</w:t>
+      </w:r>
+    </w:p>
+    <w:p>
+      <w:pPr>
+        <w:pStyle w:val="ListBullet"/>
+      </w:pPr>
+      <w:r>
+        <w:t>2024: 0.00</w:t>
+      </w:r>
+    </w:p>
+    <w:p>
+      <w:pPr>
+        <w:pStyle w:val="ListBullet"/>
+      </w:pPr>
+      <w:r>
+        <w:t>2025: 0.18</w:t>
+      </w:r>
+    </w:p>
+    <w:p>
+      <w:r>
+        <w:rPr>
+          <w:sz w:val="26"/>
+        </w:rPr>
+        <w:t>Tyler Kleven: 4</w:t>
+      </w:r>
+    </w:p>
+    <w:p>
+      <w:pPr>
+        <w:pStyle w:val="ListBullet"/>
+      </w:pPr>
+      <w:r>
+        <w:t>2022: 0.00</w:t>
+      </w:r>
+    </w:p>
+    <w:p>
+      <w:pPr>
+        <w:pStyle w:val="ListBullet"/>
+      </w:pPr>
+      <w:r>
+        <w:t>2023: 0.00</w:t>
+      </w:r>
+    </w:p>
+    <w:p>
+      <w:pPr>
+        <w:pStyle w:val="ListBullet"/>
+      </w:pPr>
+      <w:r>
+        <w:t>2024: 0.00</w:t>
+      </w:r>
+    </w:p>
+    <w:p>
+      <w:pPr>
+        <w:pStyle w:val="ListBullet"/>
+      </w:pPr>
+      <w:r>
+        <w:t>2025: 0.00</w:t>
+      </w:r>
+    </w:p>
+    <w:p>
+      <w:r>
+        <w:rPr>
+          <w:sz w:val="26"/>
+        </w:rPr>
+        <w:t>Xavier Bourgault: 2</w:t>
+      </w:r>
+    </w:p>
+    <w:p>
+      <w:pPr>
+        <w:pStyle w:val="ListBullet"/>
+      </w:pPr>
+      <w:r>
+        <w:t>2022: 0.00</w:t>
+      </w:r>
+    </w:p>
+    <w:p>
+      <w:pPr>
+        <w:pStyle w:val="ListBullet"/>
+      </w:pPr>
+      <w:r>
+        <w:t>2023: 0.00</w:t>
+      </w:r>
+    </w:p>
+    <w:p>
+      <w:pPr>
+        <w:pStyle w:val="ListBullet"/>
+      </w:pPr>
+      <w:r>
+        <w:t>2024: 0.00</w:t>
+      </w:r>
+    </w:p>
+    <w:p>
+      <w:pPr>
+        <w:pStyle w:val="ListBullet"/>
+      </w:pPr>
+      <w:r>
+        <w:t>2025: 0.00</w:t>
+      </w:r>
+    </w:p>
+    <w:p>
+      <w:r>
+        <w:rPr>
+          <w:sz w:val="26"/>
+        </w:rPr>
+        <w:t>Brady Tkachuk: 2</w:t>
+      </w:r>
+    </w:p>
+    <w:p>
+      <w:pPr>
+        <w:pStyle w:val="ListBullet"/>
+      </w:pPr>
+      <w:r>
+        <w:t>2022: 0.10</w:t>
+      </w:r>
+    </w:p>
+    <w:p>
+      <w:pPr>
+        <w:pStyle w:val="ListBullet"/>
+      </w:pPr>
+      <w:r>
+        <w:t>2023: 0.12</w:t>
+      </w:r>
+    </w:p>
+    <w:p>
+      <w:pPr>
+        <w:pStyle w:val="ListBullet"/>
+      </w:pPr>
+      <w:r>
+        <w:t>2024: 0.08</w:t>
+      </w:r>
+    </w:p>
+    <w:p>
+      <w:pPr>
+        <w:pStyle w:val="ListBullet"/>
+      </w:pPr>
+      <w:r>
+        <w:t>2025: 0.19</w:t>
+      </w:r>
+    </w:p>
+    <w:p>
+      <w:r>
+        <w:rPr>
+          <w:sz w:val="26"/>
+        </w:rPr>
+        <w:t>Stephen Halliday: 4</w:t>
+      </w:r>
+    </w:p>
+    <w:p>
+      <w:pPr>
+        <w:pStyle w:val="ListBullet"/>
+      </w:pPr>
+      <w:r>
+        <w:t>2022: 0.00</w:t>
+      </w:r>
+    </w:p>
+    <w:p>
+      <w:pPr>
+        <w:pStyle w:val="ListBullet"/>
+      </w:pPr>
+      <w:r>
+        <w:t>2023: 0.00</w:t>
+      </w:r>
+    </w:p>
+    <w:p>
+      <w:pPr>
+        <w:pStyle w:val="ListBullet"/>
+      </w:pPr>
+      <w:r>
+        <w:t>2024: 0.00</w:t>
+      </w:r>
+    </w:p>
+    <w:p>
+      <w:pPr>
+        <w:pStyle w:val="ListBullet"/>
+      </w:pPr>
+      <w:r>
+        <w:t>2025: 0.00</w:t>
+      </w:r>
+    </w:p>
+    <w:p>
+      <w:r>
+        <w:rPr>
+          <w:sz w:val="26"/>
+        </w:rPr>
+        <w:t>Arthur Kaliyev: 5</w:t>
       </w:r>
     </w:p>
     <w:p>
@@ -22107,127 +22323,15 @@
           <w:b/>
           <w:color w:val="FF0000"/>
         </w:rPr>
-        <w:t>2025: 0.20</w:t>
-      </w:r>
-    </w:p>
-    <w:p>
-      <w:r>
-        <w:rPr>
-          <w:sz w:val="26"/>
-        </w:rPr>
-        <w:t>Claude Giroux: 0</w:t>
-      </w:r>
-    </w:p>
-    <w:p>
-      <w:pPr>
-        <w:pStyle w:val="ListBullet"/>
-      </w:pPr>
-      <w:r>
-        <w:rPr>
-          <w:b/>
-          <w:color w:val="FF0000"/>
-        </w:rPr>
-        <w:t>2022: 0.53</w:t>
-      </w:r>
-    </w:p>
-    <w:p>
-      <w:pPr>
-        <w:pStyle w:val="ListBullet"/>
-      </w:pPr>
-      <w:r>
-        <w:rPr>
-          <w:b/>
-          <w:color w:val="FF0000"/>
-        </w:rPr>
-        <w:t>2023: 0.33</w:t>
-      </w:r>
-    </w:p>
-    <w:p>
-      <w:pPr>
-        <w:pStyle w:val="ListBullet"/>
-      </w:pPr>
-      <w:r>
-        <w:rPr>
-          <w:b/>
-          <w:color w:val="FF0000"/>
-        </w:rPr>
-        <w:t>2024: 0.23</w:t>
-      </w:r>
-    </w:p>
-    <w:p>
-      <w:pPr>
-        <w:pStyle w:val="ListBullet"/>
-      </w:pPr>
-      <w:r>
-        <w:t>2025: 0.09</w:t>
-      </w:r>
-    </w:p>
-    <w:p>
-      <w:r>
-        <w:rPr>
-          <w:sz w:val="26"/>
-        </w:rPr>
-        <w:t>Tyler Kleven: 3</w:t>
-      </w:r>
-    </w:p>
-    <w:p>
-      <w:pPr>
-        <w:pStyle w:val="ListBullet"/>
-      </w:pPr>
-      <w:r>
-        <w:t>2022: 0.00</w:t>
-      </w:r>
-    </w:p>
-    <w:p>
-      <w:pPr>
-        <w:pStyle w:val="ListBullet"/>
-      </w:pPr>
-      <w:r>
-        <w:t>2023: 0.00</w:t>
-      </w:r>
-    </w:p>
-    <w:p>
-      <w:pPr>
-        <w:pStyle w:val="ListBullet"/>
-      </w:pPr>
-      <w:r>
-        <w:t>2024: 0.00</w:t>
-      </w:r>
-    </w:p>
-    <w:p>
-      <w:pPr>
-        <w:pStyle w:val="ListBullet"/>
-      </w:pPr>
-      <w:r>
-        <w:rPr>
-          <w:b/>
-          <w:color w:val="FF0000"/>
-        </w:rPr>
-        <w:t>2025: 0.50</w:t>
-      </w:r>
-    </w:p>
-    <w:p>
-      <w:r>
-        <w:rPr>
-          <w:sz w:val="26"/>
-        </w:rPr>
-        <w:t>Xavier Bourgault: 2</w:t>
-      </w:r>
-    </w:p>
-    <w:p>
-      <w:pPr>
-        <w:pStyle w:val="ListBullet"/>
-      </w:pPr>
-      <w:r>
-        <w:t>2022: 0.00</w:t>
-      </w:r>
-    </w:p>
-    <w:p>
-      <w:pPr>
-        <w:pStyle w:val="ListBullet"/>
-      </w:pPr>
-      <w:r>
-        <w:t>2023: 0.00</w:t>
+        <w:t>2022: 0.20</w:t>
+      </w:r>
+    </w:p>
+    <w:p>
+      <w:pPr>
+        <w:pStyle w:val="ListBullet"/>
+      </w:pPr>
+      <w:r>
+        <w:t>2023: 0.17</w:t>
       </w:r>
     </w:p>
     <w:p>
@@ -22251,59 +22355,7 @@
         <w:rPr>
           <w:sz w:val="26"/>
         </w:rPr>
-        <w:t>Brady Tkachuk: 1</w:t>
-      </w:r>
-    </w:p>
-    <w:p>
-      <w:pPr>
-        <w:pStyle w:val="ListBullet"/>
-      </w:pPr>
-      <w:r>
-        <w:rPr>
-          <w:b/>
-          <w:color w:val="FF0000"/>
-        </w:rPr>
-        <w:t>2022: 0.24</w:t>
-      </w:r>
-    </w:p>
-    <w:p>
-      <w:pPr>
-        <w:pStyle w:val="ListBullet"/>
-      </w:pPr>
-      <w:r>
-        <w:rPr>
-          <w:b/>
-          <w:color w:val="FF0000"/>
-        </w:rPr>
-        <w:t>2023: 0.28</w:t>
-      </w:r>
-    </w:p>
-    <w:p>
-      <w:pPr>
-        <w:pStyle w:val="ListBullet"/>
-      </w:pPr>
-      <w:r>
-        <w:rPr>
-          <w:b/>
-          <w:color w:val="FF0000"/>
-        </w:rPr>
-        <w:t>2024: 0.32</w:t>
-      </w:r>
-    </w:p>
-    <w:p>
-      <w:pPr>
-        <w:pStyle w:val="ListBullet"/>
-      </w:pPr>
-      <w:r>
-        <w:t>2025: 0.19</w:t>
-      </w:r>
-    </w:p>
-    <w:p>
-      <w:r>
-        <w:rPr>
-          <w:sz w:val="26"/>
-        </w:rPr>
-        <w:t>Stephen Halliday: 4</w:t>
+        <w:t>Dennis Gilbert: 43</w:t>
       </w:r>
     </w:p>
     <w:p>
@@ -22343,139 +22395,47 @@
         <w:rPr>
           <w:sz w:val="26"/>
         </w:rPr>
-        <w:t>Arthur Kaliyev: 5</w:t>
-      </w:r>
-    </w:p>
-    <w:p>
-      <w:pPr>
-        <w:pStyle w:val="ListBullet"/>
-      </w:pPr>
-      <w:r>
-        <w:rPr>
-          <w:b/>
-          <w:color w:val="FF0000"/>
-        </w:rPr>
-        <w:t>2022: 0.20</w:t>
-      </w:r>
-    </w:p>
-    <w:p>
-      <w:pPr>
-        <w:pStyle w:val="ListBullet"/>
-      </w:pPr>
-      <w:r>
-        <w:t>2023: 0.17</w:t>
-      </w:r>
-    </w:p>
-    <w:p>
-      <w:pPr>
-        <w:pStyle w:val="ListBullet"/>
-      </w:pPr>
-      <w:r>
-        <w:t>2024: 0.00</w:t>
-      </w:r>
-    </w:p>
-    <w:p>
-      <w:pPr>
-        <w:pStyle w:val="ListBullet"/>
-      </w:pPr>
-      <w:r>
-        <w:t>2025: 0.00</w:t>
-      </w:r>
-    </w:p>
-    <w:p>
-      <w:r>
-        <w:rPr>
-          <w:sz w:val="26"/>
-        </w:rPr>
-        <w:t>Dennis Gilbert: 43</w:t>
-      </w:r>
-    </w:p>
-    <w:p>
-      <w:pPr>
-        <w:pStyle w:val="ListBullet"/>
-      </w:pPr>
-      <w:r>
-        <w:t>2022: 0.00</w:t>
-      </w:r>
-    </w:p>
-    <w:p>
-      <w:pPr>
-        <w:pStyle w:val="ListBullet"/>
-      </w:pPr>
-      <w:r>
-        <w:t>2023: 0.00</w:t>
-      </w:r>
-    </w:p>
-    <w:p>
-      <w:pPr>
-        <w:pStyle w:val="ListBullet"/>
-      </w:pPr>
-      <w:r>
-        <w:t>2024: 0.00</w:t>
-      </w:r>
-    </w:p>
-    <w:p>
-      <w:pPr>
-        <w:pStyle w:val="ListBullet"/>
-      </w:pPr>
-      <w:r>
-        <w:t>2025: 0.00</w:t>
-      </w:r>
-    </w:p>
-    <w:p>
-      <w:r>
-        <w:rPr>
-          <w:sz w:val="26"/>
-        </w:rPr>
-        <w:t>Dylan Cozens: 3</w:t>
-      </w:r>
-    </w:p>
-    <w:p>
-      <w:pPr>
-        <w:pStyle w:val="ListBullet"/>
-      </w:pPr>
-      <w:r>
-        <w:rPr>
-          <w:b/>
-          <w:color w:val="FF0000"/>
-        </w:rPr>
-        <w:t>2022: 0.27</w:t>
-      </w:r>
-    </w:p>
-    <w:p>
-      <w:pPr>
-        <w:pStyle w:val="ListBullet"/>
-      </w:pPr>
-      <w:r>
-        <w:t>2023: 0.00</w:t>
-      </w:r>
-    </w:p>
-    <w:p>
-      <w:pPr>
-        <w:pStyle w:val="ListBullet"/>
-      </w:pPr>
-      <w:r>
-        <w:t>2024: 0.13</w:t>
-      </w:r>
-    </w:p>
-    <w:p>
-      <w:pPr>
-        <w:pStyle w:val="ListBullet"/>
-      </w:pPr>
-      <w:r>
-        <w:rPr>
-          <w:b/>
-          <w:color w:val="FF0000"/>
-        </w:rPr>
-        <w:t>2025: 0.25</w:t>
-      </w:r>
-    </w:p>
-    <w:p>
-      <w:r>
-        <w:rPr>
-          <w:sz w:val="26"/>
-        </w:rPr>
-        <w:t>Ridly Greig: 0</w:t>
+        <w:t>Dylan Cozens: 4</w:t>
+      </w:r>
+    </w:p>
+    <w:p>
+      <w:pPr>
+        <w:pStyle w:val="ListBullet"/>
+      </w:pPr>
+      <w:r>
+        <w:t>2022: 0.04</w:t>
+      </w:r>
+    </w:p>
+    <w:p>
+      <w:pPr>
+        <w:pStyle w:val="ListBullet"/>
+      </w:pPr>
+      <w:r>
+        <w:t>2023: 0.13</w:t>
+      </w:r>
+    </w:p>
+    <w:p>
+      <w:pPr>
+        <w:pStyle w:val="ListBullet"/>
+      </w:pPr>
+      <w:r>
+        <w:t>2024: 0.07</w:t>
+      </w:r>
+    </w:p>
+    <w:p>
+      <w:pPr>
+        <w:pStyle w:val="ListBullet"/>
+      </w:pPr>
+      <w:r>
+        <w:t>2025: 0.10</w:t>
+      </w:r>
+    </w:p>
+    <w:p>
+      <w:r>
+        <w:rPr>
+          <w:sz w:val="26"/>
+        </w:rPr>
+        <w:t>Ridly Greig: 1</w:t>
       </w:r>
     </w:p>
     <w:p>
@@ -22499,23 +22459,15 @@
         <w:pStyle w:val="ListBullet"/>
       </w:pPr>
       <w:r>
-        <w:rPr>
-          <w:b/>
-          <w:color w:val="FF0000"/>
-        </w:rPr>
-        <w:t>2024: 0.25</w:t>
-      </w:r>
-    </w:p>
-    <w:p>
-      <w:pPr>
-        <w:pStyle w:val="ListBullet"/>
-      </w:pPr>
-      <w:r>
-        <w:rPr>
-          <w:b/>
-          <w:color w:val="FF0000"/>
-        </w:rPr>
-        <w:t>2025: 0.20</w:t>
+        <w:t>2024: 0.08</w:t>
+      </w:r>
+    </w:p>
+    <w:p>
+      <w:pPr>
+        <w:pStyle w:val="ListBullet"/>
+      </w:pPr>
+      <w:r>
+        <w:t>2025: 0.10</w:t>
       </w:r>
     </w:p>
     <w:p>

</xml_diff>